<commit_message>
Match sample screens: sidebar layout, data explorer, accuracy/feature charts, history actions; add name to report
Co-Authored-By: Claude Sonnet 5 <noreply@anthropic.com>
</commit_message>
<xml_diff>
--- a/CLO4_IDS_Report.docx
+++ b/CLO4_IDS_Report.docx
@@ -47,7 +47,7 @@
         <w:jc w:val="center"/>
       </w:pPr>
       <w:r>
-        <w:t>Name: ______________________</w:t>
+        <w:t>Name: Ijaz Ahmad</w:t>
       </w:r>
     </w:p>
     <w:p>
@@ -55,7 +55,7 @@
         <w:jc w:val="center"/>
       </w:pPr>
       <w:r>
-        <w:t>Student ID: ______________________</w:t>
+        <w:t>Student ID: 03-134231-021</w:t>
       </w:r>
     </w:p>
     <w:p>

</xml_diff>

<commit_message>
Add two-stage IDS, fix preprocessing train/serve skew, update report and README
Co-Authored-By: Claude Sonnet 5 <noreply@anthropic.com>
</commit_message>
<xml_diff>
--- a/CLO4_IDS_Report.docx
+++ b/CLO4_IDS_Report.docx
@@ -86,7 +86,7 @@
     </w:p>
     <w:p>
       <w:r>
-        <w:t>SecureNet Corp. needs a proactive layer on top of its signature-based NIDS. Using the UNSW-NB15 dataset, we built a machine-learning pipeline (cleaning, one-hot encoding, robust scaling, SMOTENC class balancing) and trained several classifiers to label traffic as Normal or one of nine attack families. LightGBM was selected as the deployed model. On the unseen UNSW-NB15 test partition (82,332 flows) it reaches 71% overall 10-class accuracy. As an attack-versus-normal detector it flags 98.9% of malicious flows (only 496 of 45,332 attacks were labelled Normal) at the cost of a 32.8% false-alarm rate on normal traffic. Rare classes (Analysis, Backdoor) are poorly identified, which is discussed as a security risk. The model is served through a FastAPI backend and a web dashboard for real-time single and batch analysis.</w:t>
+        <w:t>SecureNet Corp. needs a proactive layer on top of its signature-based NIDS. Using the UNSW-NB15 benchmark, we built a machine-learning pipeline (cleaning, one-hot encoding, robust scaling) and compared five classifiers. A first round using SMOTENC oversampling reached 71% ten-class accuracy, and our error analysis showed why it was weak: oversampling before the validation split inflated validation scores, the two dataset partitions differ in traffic mix, and a serving-time preprocessing bug degraded the deployed model. We therefore built a two-stage detector: a LightGBM classifier separates Normal from attack traffic, and a second LightGBM names the attack family. On the unseen test partition (82,332 flows) it reaches 77.4% ten-class accuracy, 91.1% Normal-vs-attack accuracy, 96.5% attack recall and a ROC-AUC of 0.985, at a 15.4% false-alarm rate that can be lowered through the alert threshold (2.6% false alarms at 89% recall). The rare Analysis and Backdoor families remain hard to identify. The model is served through a FastAPI backend and a web dashboard for real-time single-flow and batch analysis.</w:t>
       </w:r>
     </w:p>
     <w:p>
@@ -234,7 +234,12 @@
     </w:p>
     <w:p>
       <w:r>
-        <w:t>Six classifiers were built on the same preprocessing pipeline: Random Forest, XGBoost, LightGBM, scikit-learn MLP, a Keras deep neural network (batch-norm + dropout) and TabNet. Gradient-boosted trees suit tabular flow data: they model non-linear feature interactions, tolerate mixed-scale features, train quickly and give fast inference, which matters for real-time detection. LightGBM was chosen as the final model because it matched XGBoost on accuracy while being faster, and it clearly beat the neural networks on the unseen test set.</w:t>
+        <w:t>Five classifiers were trained on the same pipeline: Random Forest, XGBoost, LightGBM, an scikit-learn MLP, a Keras deep neural network and TabNet. Gradient-boosted trees suit tabular flow data: they model non-linear feature interactions, tolerate mixed-scale features, train quickly and give fast inference, which matters for real-time detection. The neural networks generalised worst on the unseen partition.</w:t>
+      </w:r>
+    </w:p>
+    <w:p>
+      <w:r>
+        <w:t>The deployed model is a two-stage design (LightGBM, regularised: 15 leaves, L2 penalty, 300 trees at learning rate 0.05). Stage 1 is a binary Normal-vs-attack detector whose alert threshold is tunable, which lets a SOC trade recall against false alarms. Stage 2 is trained only on attack flows, with class weights for the rare families, and names the attack family for flows that stage 1 flags. Class weights replace SMOTENC because oversampling created up to 430 synthetic copies per real Worms flow and made validation scores unreliable. The alert threshold (0.66) was chosen on a 20% slice of the training partition, never on the test set.</w:t>
       </w:r>
     </w:p>
     <w:p>
@@ -260,16 +265,16 @@
         <w:tblLook w:firstColumn="1" w:firstRow="1" w:lastColumn="0" w:lastRow="0" w:noHBand="0" w:noVBand="1" w:val="04A0"/>
       </w:tblPr>
       <w:tblGrid>
-        <w:gridCol w:w="1872"/>
-        <w:gridCol w:w="1872"/>
-        <w:gridCol w:w="1872"/>
-        <w:gridCol w:w="1872"/>
-        <w:gridCol w:w="1872"/>
+        <w:gridCol w:w="1958"/>
+        <w:gridCol w:w="1958"/>
+        <w:gridCol w:w="1958"/>
+        <w:gridCol w:w="1958"/>
+        <w:gridCol w:w="1958"/>
       </w:tblGrid>
       <w:tr>
         <w:tc>
           <w:tcPr>
-            <w:tcW w:type="dxa" w:w="1872"/>
+            <w:tcW w:type="dxa" w:w="1958"/>
           </w:tcPr>
           <w:p>
             <w:r>
@@ -279,41 +284,41 @@
         </w:tc>
         <w:tc>
           <w:tcPr>
-            <w:tcW w:type="dxa" w:w="1872"/>
+            <w:tcW w:type="dxa" w:w="1958"/>
           </w:tcPr>
           <w:p>
             <w:r>
-              <w:t>Validation accuracy</w:t>
+              <w:t>10-class accuracy</w:t>
             </w:r>
           </w:p>
         </w:tc>
         <w:tc>
           <w:tcPr>
-            <w:tcW w:type="dxa" w:w="1872"/>
+            <w:tcW w:type="dxa" w:w="1958"/>
           </w:tcPr>
           <w:p>
             <w:r>
-              <w:t>Test accuracy</w:t>
+              <w:t>Macro F1</w:t>
             </w:r>
           </w:p>
         </w:tc>
         <w:tc>
           <w:tcPr>
-            <w:tcW w:type="dxa" w:w="1872"/>
+            <w:tcW w:type="dxa" w:w="1958"/>
           </w:tcPr>
           <w:p>
             <w:r>
-              <w:t>Test macro F1</w:t>
+              <w:t>Attack recall</w:t>
             </w:r>
           </w:p>
         </w:tc>
         <w:tc>
           <w:tcPr>
-            <w:tcW w:type="dxa" w:w="1872"/>
+            <w:tcW w:type="dxa" w:w="1958"/>
           </w:tcPr>
           <w:p>
             <w:r>
-              <w:t>Test macro recall</w:t>
+              <w:t>False-alarm rate</w:t>
             </w:r>
           </w:p>
         </w:tc>
@@ -321,27 +326,69 @@
       <w:tr>
         <w:tc>
           <w:tcPr>
-            <w:tcW w:type="dxa" w:w="1872"/>
+            <w:tcW w:type="dxa" w:w="1958"/>
           </w:tcPr>
           <w:p>
             <w:r>
-              <w:t>LightGBM</w:t>
+              <w:t>Two-Stage IDS (deployed)</w:t>
             </w:r>
           </w:p>
         </w:tc>
         <w:tc>
           <w:tcPr>
-            <w:tcW w:type="dxa" w:w="1872"/>
+            <w:tcW w:type="dxa" w:w="1958"/>
           </w:tcPr>
           <w:p>
             <w:r>
-              <w:t>0.78</w:t>
+              <w:t>0.774</w:t>
             </w:r>
           </w:p>
         </w:tc>
         <w:tc>
           <w:tcPr>
-            <w:tcW w:type="dxa" w:w="1872"/>
+            <w:tcW w:type="dxa" w:w="1958"/>
+          </w:tcPr>
+          <w:p>
+            <w:r>
+              <w:t>0.516</w:t>
+            </w:r>
+          </w:p>
+        </w:tc>
+        <w:tc>
+          <w:tcPr>
+            <w:tcW w:type="dxa" w:w="1958"/>
+          </w:tcPr>
+          <w:p>
+            <w:r>
+              <w:t>0.965</w:t>
+            </w:r>
+          </w:p>
+        </w:tc>
+        <w:tc>
+          <w:tcPr>
+            <w:tcW w:type="dxa" w:w="1958"/>
+          </w:tcPr>
+          <w:p>
+            <w:r>
+              <w:t>0.154</w:t>
+            </w:r>
+          </w:p>
+        </w:tc>
+      </w:tr>
+      <w:tr>
+        <w:tc>
+          <w:tcPr>
+            <w:tcW w:type="dxa" w:w="1958"/>
+          </w:tcPr>
+          <w:p>
+            <w:r>
+              <w:t>LightGBM (SMOTENC, first round)</w:t>
+            </w:r>
+          </w:p>
+        </w:tc>
+        <w:tc>
+          <w:tcPr>
+            <w:tcW w:type="dxa" w:w="1958"/>
           </w:tcPr>
           <w:p>
             <w:r>
@@ -351,7 +398,7 @@
         </w:tc>
         <w:tc>
           <w:tcPr>
-            <w:tcW w:type="dxa" w:w="1872"/>
+            <w:tcW w:type="dxa" w:w="1958"/>
           </w:tcPr>
           <w:p>
             <w:r>
@@ -361,11 +408,21 @@
         </w:tc>
         <w:tc>
           <w:tcPr>
-            <w:tcW w:type="dxa" w:w="1872"/>
+            <w:tcW w:type="dxa" w:w="1958"/>
           </w:tcPr>
           <w:p>
             <w:r>
-              <w:t>0.62</w:t>
+              <w:t>0.989</w:t>
+            </w:r>
+          </w:p>
+        </w:tc>
+        <w:tc>
+          <w:tcPr>
+            <w:tcW w:type="dxa" w:w="1958"/>
+          </w:tcPr>
+          <w:p>
+            <w:r>
+              <w:t>0.328</w:t>
             </w:r>
           </w:p>
         </w:tc>
@@ -373,27 +430,17 @@
       <w:tr>
         <w:tc>
           <w:tcPr>
-            <w:tcW w:type="dxa" w:w="1872"/>
+            <w:tcW w:type="dxa" w:w="1958"/>
           </w:tcPr>
           <w:p>
             <w:r>
-              <w:t>XGBoost</w:t>
+              <w:t>XGBoost (SMOTENC)</w:t>
             </w:r>
           </w:p>
         </w:tc>
         <w:tc>
           <w:tcPr>
-            <w:tcW w:type="dxa" w:w="1872"/>
-          </w:tcPr>
-          <w:p>
-            <w:r>
-              <w:t>0.78</w:t>
-            </w:r>
-          </w:p>
-        </w:tc>
-        <w:tc>
-          <w:tcPr>
-            <w:tcW w:type="dxa" w:w="1872"/>
+            <w:tcW w:type="dxa" w:w="1958"/>
           </w:tcPr>
           <w:p>
             <w:r>
@@ -403,7 +450,7 @@
         </w:tc>
         <w:tc>
           <w:tcPr>
-            <w:tcW w:type="dxa" w:w="1872"/>
+            <w:tcW w:type="dxa" w:w="1958"/>
           </w:tcPr>
           <w:p>
             <w:r>
@@ -413,11 +460,21 @@
         </w:tc>
         <w:tc>
           <w:tcPr>
-            <w:tcW w:type="dxa" w:w="1872"/>
+            <w:tcW w:type="dxa" w:w="1958"/>
           </w:tcPr>
           <w:p>
             <w:r>
-              <w:t>0.61</w:t>
+              <w:t>-</w:t>
+            </w:r>
+          </w:p>
+        </w:tc>
+        <w:tc>
+          <w:tcPr>
+            <w:tcW w:type="dxa" w:w="1958"/>
+          </w:tcPr>
+          <w:p>
+            <w:r>
+              <w:t>-</w:t>
             </w:r>
           </w:p>
         </w:tc>
@@ -425,27 +482,17 @@
       <w:tr>
         <w:tc>
           <w:tcPr>
-            <w:tcW w:type="dxa" w:w="1872"/>
+            <w:tcW w:type="dxa" w:w="1958"/>
           </w:tcPr>
           <w:p>
             <w:r>
-              <w:t>MLP (sklearn)</w:t>
+              <w:t>MLP (SMOTENC)</w:t>
             </w:r>
           </w:p>
         </w:tc>
         <w:tc>
           <w:tcPr>
-            <w:tcW w:type="dxa" w:w="1872"/>
-          </w:tcPr>
-          <w:p>
-            <w:r>
-              <w:t>0.77</w:t>
-            </w:r>
-          </w:p>
-        </w:tc>
-        <w:tc>
-          <w:tcPr>
-            <w:tcW w:type="dxa" w:w="1872"/>
+            <w:tcW w:type="dxa" w:w="1958"/>
           </w:tcPr>
           <w:p>
             <w:r>
@@ -455,7 +502,7 @@
         </w:tc>
         <w:tc>
           <w:tcPr>
-            <w:tcW w:type="dxa" w:w="1872"/>
+            <w:tcW w:type="dxa" w:w="1958"/>
           </w:tcPr>
           <w:p>
             <w:r>
@@ -465,11 +512,21 @@
         </w:tc>
         <w:tc>
           <w:tcPr>
-            <w:tcW w:type="dxa" w:w="1872"/>
+            <w:tcW w:type="dxa" w:w="1958"/>
           </w:tcPr>
           <w:p>
             <w:r>
-              <w:t>0.53</w:t>
+              <w:t>-</w:t>
+            </w:r>
+          </w:p>
+        </w:tc>
+        <w:tc>
+          <w:tcPr>
+            <w:tcW w:type="dxa" w:w="1958"/>
+          </w:tcPr>
+          <w:p>
+            <w:r>
+              <w:t>-</w:t>
             </w:r>
           </w:p>
         </w:tc>
@@ -477,27 +534,17 @@
       <w:tr>
         <w:tc>
           <w:tcPr>
-            <w:tcW w:type="dxa" w:w="1872"/>
+            <w:tcW w:type="dxa" w:w="1958"/>
           </w:tcPr>
           <w:p>
             <w:r>
-              <w:t>Deep NN (Keras)</w:t>
+              <w:t>Deep NN (SMOTENC)</w:t>
             </w:r>
           </w:p>
         </w:tc>
         <w:tc>
           <w:tcPr>
-            <w:tcW w:type="dxa" w:w="1872"/>
-          </w:tcPr>
-          <w:p>
-            <w:r>
-              <w:t>0.56</w:t>
-            </w:r>
-          </w:p>
-        </w:tc>
-        <w:tc>
-          <w:tcPr>
-            <w:tcW w:type="dxa" w:w="1872"/>
+            <w:tcW w:type="dxa" w:w="1958"/>
           </w:tcPr>
           <w:p>
             <w:r>
@@ -507,7 +554,7 @@
         </w:tc>
         <w:tc>
           <w:tcPr>
-            <w:tcW w:type="dxa" w:w="1872"/>
+            <w:tcW w:type="dxa" w:w="1958"/>
           </w:tcPr>
           <w:p>
             <w:r>
@@ -517,11 +564,21 @@
         </w:tc>
         <w:tc>
           <w:tcPr>
-            <w:tcW w:type="dxa" w:w="1872"/>
+            <w:tcW w:type="dxa" w:w="1958"/>
           </w:tcPr>
           <w:p>
             <w:r>
-              <w:t>0.44</w:t>
+              <w:t>-</w:t>
+            </w:r>
+          </w:p>
+        </w:tc>
+        <w:tc>
+          <w:tcPr>
+            <w:tcW w:type="dxa" w:w="1958"/>
+          </w:tcPr>
+          <w:p>
+            <w:r>
+              <w:t>-</w:t>
             </w:r>
           </w:p>
         </w:tc>
@@ -529,11 +586,16 @@
     </w:tbl>
     <w:p/>
     <w:p>
+      <w:r>
+        <w:t>Attack recall and false-alarm rate treat every attack family as one "attack" class. The first-round LightGBM found slightly more attacks but flagged a third of normal traffic, which would overwhelm analysts; the two-stage model halves the false alarms while raising overall accuracy by six points.</w:t>
+      </w:r>
+    </w:p>
+    <w:p>
       <w:pPr>
         <w:pStyle w:val="Heading2"/>
       </w:pPr>
       <w:r>
-        <w:t>3.2 Per-Class Precision / Recall (LightGBM, test set)</w:t>
+        <w:t>3.2 Choosing the Alert Threshold</w:t>
       </w:r>
     </w:p>
     <w:tbl>
@@ -543,15 +605,294 @@
         <w:tblLook w:firstColumn="1" w:firstRow="1" w:lastColumn="0" w:lastRow="0" w:noHBand="0" w:noVBand="1" w:val="04A0"/>
       </w:tblPr>
       <w:tblGrid>
-        <w:gridCol w:w="2340"/>
-        <w:gridCol w:w="2340"/>
-        <w:gridCol w:w="2340"/>
-        <w:gridCol w:w="2340"/>
+        <w:gridCol w:w="2448"/>
+        <w:gridCol w:w="2448"/>
+        <w:gridCol w:w="2448"/>
+        <w:gridCol w:w="2448"/>
       </w:tblGrid>
       <w:tr>
         <w:tc>
           <w:tcPr>
-            <w:tcW w:type="dxa" w:w="2340"/>
+            <w:tcW w:type="dxa" w:w="2448"/>
+          </w:tcPr>
+          <w:p>
+            <w:r>
+              <w:t>Threshold</w:t>
+            </w:r>
+          </w:p>
+        </w:tc>
+        <w:tc>
+          <w:tcPr>
+            <w:tcW w:type="dxa" w:w="2448"/>
+          </w:tcPr>
+          <w:p>
+            <w:r>
+              <w:t>Binary accuracy</w:t>
+            </w:r>
+          </w:p>
+        </w:tc>
+        <w:tc>
+          <w:tcPr>
+            <w:tcW w:type="dxa" w:w="2448"/>
+          </w:tcPr>
+          <w:p>
+            <w:r>
+              <w:t>Attack recall</w:t>
+            </w:r>
+          </w:p>
+        </w:tc>
+        <w:tc>
+          <w:tcPr>
+            <w:tcW w:type="dxa" w:w="2448"/>
+          </w:tcPr>
+          <w:p>
+            <w:r>
+              <w:t>False alarms</w:t>
+            </w:r>
+          </w:p>
+        </w:tc>
+      </w:tr>
+      <w:tr>
+        <w:tc>
+          <w:tcPr>
+            <w:tcW w:type="dxa" w:w="2448"/>
+          </w:tcPr>
+          <w:p>
+            <w:r>
+              <w:t>0.50</w:t>
+            </w:r>
+          </w:p>
+        </w:tc>
+        <w:tc>
+          <w:tcPr>
+            <w:tcW w:type="dxa" w:w="2448"/>
+          </w:tcPr>
+          <w:p>
+            <w:r>
+              <w:t>0.875</w:t>
+            </w:r>
+          </w:p>
+        </w:tc>
+        <w:tc>
+          <w:tcPr>
+            <w:tcW w:type="dxa" w:w="2448"/>
+          </w:tcPr>
+          <w:p>
+            <w:r>
+              <w:t>98.6%</w:t>
+            </w:r>
+          </w:p>
+        </w:tc>
+        <w:tc>
+          <w:tcPr>
+            <w:tcW w:type="dxa" w:w="2448"/>
+          </w:tcPr>
+          <w:p>
+            <w:r>
+              <w:t>26.0%</w:t>
+            </w:r>
+          </w:p>
+        </w:tc>
+      </w:tr>
+      <w:tr>
+        <w:tc>
+          <w:tcPr>
+            <w:tcW w:type="dxa" w:w="2448"/>
+          </w:tcPr>
+          <w:p>
+            <w:r>
+              <w:t>0.66 (chosen)</w:t>
+            </w:r>
+          </w:p>
+        </w:tc>
+        <w:tc>
+          <w:tcPr>
+            <w:tcW w:type="dxa" w:w="2448"/>
+          </w:tcPr>
+          <w:p>
+            <w:r>
+              <w:t>0.911</w:t>
+            </w:r>
+          </w:p>
+        </w:tc>
+        <w:tc>
+          <w:tcPr>
+            <w:tcW w:type="dxa" w:w="2448"/>
+          </w:tcPr>
+          <w:p>
+            <w:r>
+              <w:t>96.5%</w:t>
+            </w:r>
+          </w:p>
+        </w:tc>
+        <w:tc>
+          <w:tcPr>
+            <w:tcW w:type="dxa" w:w="2448"/>
+          </w:tcPr>
+          <w:p>
+            <w:r>
+              <w:t>15.4%</w:t>
+            </w:r>
+          </w:p>
+        </w:tc>
+      </w:tr>
+      <w:tr>
+        <w:tc>
+          <w:tcPr>
+            <w:tcW w:type="dxa" w:w="2448"/>
+          </w:tcPr>
+          <w:p>
+            <w:r>
+              <w:t>0.80</w:t>
+            </w:r>
+          </w:p>
+        </w:tc>
+        <w:tc>
+          <w:tcPr>
+            <w:tcW w:type="dxa" w:w="2448"/>
+          </w:tcPr>
+          <w:p>
+            <w:r>
+              <w:t>0.926</w:t>
+            </w:r>
+          </w:p>
+        </w:tc>
+        <w:tc>
+          <w:tcPr>
+            <w:tcW w:type="dxa" w:w="2448"/>
+          </w:tcPr>
+          <w:p>
+            <w:r>
+              <w:t>93.2%</w:t>
+            </w:r>
+          </w:p>
+        </w:tc>
+        <w:tc>
+          <w:tcPr>
+            <w:tcW w:type="dxa" w:w="2448"/>
+          </w:tcPr>
+          <w:p>
+            <w:r>
+              <w:t>8.0%</w:t>
+            </w:r>
+          </w:p>
+        </w:tc>
+      </w:tr>
+      <w:tr>
+        <w:tc>
+          <w:tcPr>
+            <w:tcW w:type="dxa" w:w="2448"/>
+          </w:tcPr>
+          <w:p>
+            <w:r>
+              <w:t>0.90</w:t>
+            </w:r>
+          </w:p>
+        </w:tc>
+        <w:tc>
+          <w:tcPr>
+            <w:tcW w:type="dxa" w:w="2448"/>
+          </w:tcPr>
+          <w:p>
+            <w:r>
+              <w:t>0.929</w:t>
+            </w:r>
+          </w:p>
+        </w:tc>
+        <w:tc>
+          <w:tcPr>
+            <w:tcW w:type="dxa" w:w="2448"/>
+          </w:tcPr>
+          <w:p>
+            <w:r>
+              <w:t>89.2%</w:t>
+            </w:r>
+          </w:p>
+        </w:tc>
+        <w:tc>
+          <w:tcPr>
+            <w:tcW w:type="dxa" w:w="2448"/>
+          </w:tcPr>
+          <w:p>
+            <w:r>
+              <w:t>2.6%</w:t>
+            </w:r>
+          </w:p>
+        </w:tc>
+      </w:tr>
+      <w:tr>
+        <w:tc>
+          <w:tcPr>
+            <w:tcW w:type="dxa" w:w="2448"/>
+          </w:tcPr>
+          <w:p>
+            <w:r>
+              <w:t>0.95</w:t>
+            </w:r>
+          </w:p>
+        </w:tc>
+        <w:tc>
+          <w:tcPr>
+            <w:tcW w:type="dxa" w:w="2448"/>
+          </w:tcPr>
+          <w:p>
+            <w:r>
+              <w:t>0.919</w:t>
+            </w:r>
+          </w:p>
+        </w:tc>
+        <w:tc>
+          <w:tcPr>
+            <w:tcW w:type="dxa" w:w="2448"/>
+          </w:tcPr>
+          <w:p>
+            <w:r>
+              <w:t>86.0%</w:t>
+            </w:r>
+          </w:p>
+        </w:tc>
+        <w:tc>
+          <w:tcPr>
+            <w:tcW w:type="dxa" w:w="2448"/>
+          </w:tcPr>
+          <w:p>
+            <w:r>
+              <w:t>0.9%</w:t>
+            </w:r>
+          </w:p>
+        </w:tc>
+      </w:tr>
+    </w:tbl>
+    <w:p/>
+    <w:p>
+      <w:r>
+        <w:t>The threshold is an operational decision. A stricter threshold suits a small team that cannot triage many alerts; a lenient one suits a high-value network where a missed attack is unacceptable. The threshold chosen on training data gave 15% false alarms on the test partition rather than the 5% target, because the partitions differ in traffic mix (Normal is 32% of training but 45% of test flows, and features such as ct_state_ttl shift by about one standard deviation).</w:t>
+      </w:r>
+    </w:p>
+    <w:p>
+      <w:pPr>
+        <w:pStyle w:val="Heading2"/>
+      </w:pPr>
+      <w:r>
+        <w:t>3.3 Per-Class Precision / Recall (Two-Stage IDS, test set)</w:t>
+      </w:r>
+    </w:p>
+    <w:tbl>
+      <w:tblPr>
+        <w:tblStyle w:val="LightGrid-Accent1"/>
+        <w:tblW w:type="auto" w:w="0"/>
+        <w:tblLook w:firstColumn="1" w:firstRow="1" w:lastColumn="0" w:lastRow="0" w:noHBand="0" w:noVBand="1" w:val="04A0"/>
+      </w:tblPr>
+      <w:tblGrid>
+        <w:gridCol w:w="2448"/>
+        <w:gridCol w:w="2448"/>
+        <w:gridCol w:w="2448"/>
+        <w:gridCol w:w="2448"/>
+      </w:tblGrid>
+      <w:tr>
+        <w:tc>
+          <w:tcPr>
+            <w:tcW w:type="dxa" w:w="2448"/>
           </w:tcPr>
           <w:p>
             <w:r>
@@ -561,7 +902,7 @@
         </w:tc>
         <w:tc>
           <w:tcPr>
-            <w:tcW w:type="dxa" w:w="2340"/>
+            <w:tcW w:type="dxa" w:w="2448"/>
           </w:tcPr>
           <w:p>
             <w:r>
@@ -571,7 +912,7 @@
         </w:tc>
         <w:tc>
           <w:tcPr>
-            <w:tcW w:type="dxa" w:w="2340"/>
+            <w:tcW w:type="dxa" w:w="2448"/>
           </w:tcPr>
           <w:p>
             <w:r>
@@ -581,7 +922,7 @@
         </w:tc>
         <w:tc>
           <w:tcPr>
-            <w:tcW w:type="dxa" w:w="2340"/>
+            <w:tcW w:type="dxa" w:w="2448"/>
           </w:tcPr>
           <w:p>
             <w:r>
@@ -593,7 +934,7 @@
       <w:tr>
         <w:tc>
           <w:tcPr>
-            <w:tcW w:type="dxa" w:w="2340"/>
+            <w:tcW w:type="dxa" w:w="2448"/>
           </w:tcPr>
           <w:p>
             <w:r>
@@ -603,27 +944,27 @@
         </w:tc>
         <w:tc>
           <w:tcPr>
-            <w:tcW w:type="dxa" w:w="2340"/>
+            <w:tcW w:type="dxa" w:w="2448"/>
           </w:tcPr>
           <w:p>
             <w:r>
-              <w:t>0.03</w:t>
+              <w:t>0.04</w:t>
             </w:r>
           </w:p>
         </w:tc>
         <w:tc>
           <w:tcPr>
-            <w:tcW w:type="dxa" w:w="2340"/>
+            <w:tcW w:type="dxa" w:w="2448"/>
           </w:tcPr>
           <w:p>
             <w:r>
-              <w:t>0.15</w:t>
+              <w:t>0.07</w:t>
             </w:r>
           </w:p>
         </w:tc>
         <w:tc>
           <w:tcPr>
-            <w:tcW w:type="dxa" w:w="2340"/>
+            <w:tcW w:type="dxa" w:w="2448"/>
           </w:tcPr>
           <w:p>
             <w:r>
@@ -635,7 +976,7 @@
       <w:tr>
         <w:tc>
           <w:tcPr>
-            <w:tcW w:type="dxa" w:w="2340"/>
+            <w:tcW w:type="dxa" w:w="2448"/>
           </w:tcPr>
           <w:p>
             <w:r>
@@ -645,27 +986,27 @@
         </w:tc>
         <w:tc>
           <w:tcPr>
-            <w:tcW w:type="dxa" w:w="2340"/>
+            <w:tcW w:type="dxa" w:w="2448"/>
           </w:tcPr>
           <w:p>
             <w:r>
-              <w:t>0.04</w:t>
+              <w:t>0.07</w:t>
             </w:r>
           </w:p>
         </w:tc>
         <w:tc>
           <w:tcPr>
-            <w:tcW w:type="dxa" w:w="2340"/>
+            <w:tcW w:type="dxa" w:w="2448"/>
           </w:tcPr>
           <w:p>
             <w:r>
-              <w:t>0.22</w:t>
+              <w:t>0.88</w:t>
             </w:r>
           </w:p>
         </w:tc>
         <w:tc>
           <w:tcPr>
-            <w:tcW w:type="dxa" w:w="2340"/>
+            <w:tcW w:type="dxa" w:w="2448"/>
           </w:tcPr>
           <w:p>
             <w:r>
@@ -677,7 +1018,7 @@
       <w:tr>
         <w:tc>
           <w:tcPr>
-            <w:tcW w:type="dxa" w:w="2340"/>
+            <w:tcW w:type="dxa" w:w="2448"/>
           </w:tcPr>
           <w:p>
             <w:r>
@@ -687,27 +1028,27 @@
         </w:tc>
         <w:tc>
           <w:tcPr>
-            <w:tcW w:type="dxa" w:w="2340"/>
+            <w:tcW w:type="dxa" w:w="2448"/>
           </w:tcPr>
           <w:p>
             <w:r>
-              <w:t>0.33</w:t>
+              <w:t>0.45</w:t>
             </w:r>
           </w:p>
         </w:tc>
         <w:tc>
           <w:tcPr>
-            <w:tcW w:type="dxa" w:w="2340"/>
+            <w:tcW w:type="dxa" w:w="2448"/>
           </w:tcPr>
           <w:p>
             <w:r>
-              <w:t>0.41</w:t>
+              <w:t>0.19</w:t>
             </w:r>
           </w:p>
         </w:tc>
         <w:tc>
           <w:tcPr>
-            <w:tcW w:type="dxa" w:w="2340"/>
+            <w:tcW w:type="dxa" w:w="2448"/>
           </w:tcPr>
           <w:p>
             <w:r>
@@ -719,7 +1060,7 @@
       <w:tr>
         <w:tc>
           <w:tcPr>
-            <w:tcW w:type="dxa" w:w="2340"/>
+            <w:tcW w:type="dxa" w:w="2448"/>
           </w:tcPr>
           <w:p>
             <w:r>
@@ -729,27 +1070,27 @@
         </w:tc>
         <w:tc>
           <w:tcPr>
-            <w:tcW w:type="dxa" w:w="2340"/>
+            <w:tcW w:type="dxa" w:w="2448"/>
           </w:tcPr>
           <w:p>
             <w:r>
-              <w:t>0.80</w:t>
+              <w:t>0.83</w:t>
             </w:r>
           </w:p>
         </w:tc>
         <w:tc>
           <w:tcPr>
-            <w:tcW w:type="dxa" w:w="2340"/>
+            <w:tcW w:type="dxa" w:w="2448"/>
           </w:tcPr>
           <w:p>
             <w:r>
-              <w:t>0.61</w:t>
+              <w:t>0.59</w:t>
             </w:r>
           </w:p>
         </w:tc>
         <w:tc>
           <w:tcPr>
-            <w:tcW w:type="dxa" w:w="2340"/>
+            <w:tcW w:type="dxa" w:w="2448"/>
           </w:tcPr>
           <w:p>
             <w:r>
@@ -761,7 +1102,7 @@
       <w:tr>
         <w:tc>
           <w:tcPr>
-            <w:tcW w:type="dxa" w:w="2340"/>
+            <w:tcW w:type="dxa" w:w="2448"/>
           </w:tcPr>
           <w:p>
             <w:r>
@@ -771,27 +1112,27 @@
         </w:tc>
         <w:tc>
           <w:tcPr>
-            <w:tcW w:type="dxa" w:w="2340"/>
+            <w:tcW w:type="dxa" w:w="2448"/>
           </w:tcPr>
           <w:p>
             <w:r>
-              <w:t>0.28</w:t>
+              <w:t>0.38</w:t>
             </w:r>
           </w:p>
         </w:tc>
         <w:tc>
           <w:tcPr>
-            <w:tcW w:type="dxa" w:w="2340"/>
+            <w:tcW w:type="dxa" w:w="2448"/>
           </w:tcPr>
           <w:p>
             <w:r>
-              <w:t>0.62</w:t>
+              <w:t>0.47</w:t>
             </w:r>
           </w:p>
         </w:tc>
         <w:tc>
           <w:tcPr>
-            <w:tcW w:type="dxa" w:w="2340"/>
+            <w:tcW w:type="dxa" w:w="2448"/>
           </w:tcPr>
           <w:p>
             <w:r>
@@ -803,7 +1144,7 @@
       <w:tr>
         <w:tc>
           <w:tcPr>
-            <w:tcW w:type="dxa" w:w="2340"/>
+            <w:tcW w:type="dxa" w:w="2448"/>
           </w:tcPr>
           <w:p>
             <w:r>
@@ -813,7 +1154,7 @@
         </w:tc>
         <w:tc>
           <w:tcPr>
-            <w:tcW w:type="dxa" w:w="2340"/>
+            <w:tcW w:type="dxa" w:w="2448"/>
           </w:tcPr>
           <w:p>
             <w:r>
@@ -823,7 +1164,7 @@
         </w:tc>
         <w:tc>
           <w:tcPr>
-            <w:tcW w:type="dxa" w:w="2340"/>
+            <w:tcW w:type="dxa" w:w="2448"/>
           </w:tcPr>
           <w:p>
             <w:r>
@@ -833,7 +1174,7 @@
         </w:tc>
         <w:tc>
           <w:tcPr>
-            <w:tcW w:type="dxa" w:w="2340"/>
+            <w:tcW w:type="dxa" w:w="2448"/>
           </w:tcPr>
           <w:p>
             <w:r>
@@ -845,7 +1186,7 @@
       <w:tr>
         <w:tc>
           <w:tcPr>
-            <w:tcW w:type="dxa" w:w="2340"/>
+            <w:tcW w:type="dxa" w:w="2448"/>
           </w:tcPr>
           <w:p>
             <w:r>
@@ -855,27 +1196,27 @@
         </w:tc>
         <w:tc>
           <w:tcPr>
-            <w:tcW w:type="dxa" w:w="2340"/>
+            <w:tcW w:type="dxa" w:w="2448"/>
           </w:tcPr>
           <w:p>
             <w:r>
-              <w:t>0.98</w:t>
+              <w:t>0.95</w:t>
             </w:r>
           </w:p>
         </w:tc>
         <w:tc>
           <w:tcPr>
-            <w:tcW w:type="dxa" w:w="2340"/>
+            <w:tcW w:type="dxa" w:w="2448"/>
           </w:tcPr>
           <w:p>
             <w:r>
-              <w:t>0.67</w:t>
+              <w:t>0.85</w:t>
             </w:r>
           </w:p>
         </w:tc>
         <w:tc>
           <w:tcPr>
-            <w:tcW w:type="dxa" w:w="2340"/>
+            <w:tcW w:type="dxa" w:w="2448"/>
           </w:tcPr>
           <w:p>
             <w:r>
@@ -887,7 +1228,7 @@
       <w:tr>
         <w:tc>
           <w:tcPr>
-            <w:tcW w:type="dxa" w:w="2340"/>
+            <w:tcW w:type="dxa" w:w="2448"/>
           </w:tcPr>
           <w:p>
             <w:r>
@@ -897,27 +1238,27 @@
         </w:tc>
         <w:tc>
           <w:tcPr>
-            <w:tcW w:type="dxa" w:w="2340"/>
+            <w:tcW w:type="dxa" w:w="2448"/>
           </w:tcPr>
           <w:p>
             <w:r>
-              <w:t>0.87</w:t>
+              <w:t>0.85</w:t>
             </w:r>
           </w:p>
         </w:tc>
         <w:tc>
           <w:tcPr>
-            <w:tcW w:type="dxa" w:w="2340"/>
+            <w:tcW w:type="dxa" w:w="2448"/>
           </w:tcPr>
           <w:p>
             <w:r>
-              <w:t>0.82</w:t>
+              <w:t>0.85</w:t>
             </w:r>
           </w:p>
         </w:tc>
         <w:tc>
           <w:tcPr>
-            <w:tcW w:type="dxa" w:w="2340"/>
+            <w:tcW w:type="dxa" w:w="2448"/>
           </w:tcPr>
           <w:p>
             <w:r>
@@ -929,7 +1270,7 @@
       <w:tr>
         <w:tc>
           <w:tcPr>
-            <w:tcW w:type="dxa" w:w="2340"/>
+            <w:tcW w:type="dxa" w:w="2448"/>
           </w:tcPr>
           <w:p>
             <w:r>
@@ -939,27 +1280,27 @@
         </w:tc>
         <w:tc>
           <w:tcPr>
-            <w:tcW w:type="dxa" w:w="2340"/>
+            <w:tcW w:type="dxa" w:w="2448"/>
           </w:tcPr>
           <w:p>
             <w:r>
-              <w:t>0.18</w:t>
+              <w:t>0.22</w:t>
             </w:r>
           </w:p>
         </w:tc>
         <w:tc>
           <w:tcPr>
-            <w:tcW w:type="dxa" w:w="2340"/>
+            <w:tcW w:type="dxa" w:w="2448"/>
           </w:tcPr>
           <w:p>
             <w:r>
-              <w:t>0.91</w:t>
+              <w:t>0.97</w:t>
             </w:r>
           </w:p>
         </w:tc>
         <w:tc>
           <w:tcPr>
-            <w:tcW w:type="dxa" w:w="2340"/>
+            <w:tcW w:type="dxa" w:w="2448"/>
           </w:tcPr>
           <w:p>
             <w:r>
@@ -971,7 +1312,7 @@
       <w:tr>
         <w:tc>
           <w:tcPr>
-            <w:tcW w:type="dxa" w:w="2340"/>
+            <w:tcW w:type="dxa" w:w="2448"/>
           </w:tcPr>
           <w:p>
             <w:r>
@@ -981,27 +1322,27 @@
         </w:tc>
         <w:tc>
           <w:tcPr>
-            <w:tcW w:type="dxa" w:w="2340"/>
+            <w:tcW w:type="dxa" w:w="2448"/>
           </w:tcPr>
           <w:p>
             <w:r>
-              <w:t>0.18</w:t>
+              <w:t>0.37</w:t>
             </w:r>
           </w:p>
         </w:tc>
         <w:tc>
           <w:tcPr>
-            <w:tcW w:type="dxa" w:w="2340"/>
+            <w:tcW w:type="dxa" w:w="2448"/>
           </w:tcPr>
           <w:p>
             <w:r>
-              <w:t>0.80</w:t>
+              <w:t>0.86</w:t>
             </w:r>
           </w:p>
         </w:tc>
         <w:tc>
           <w:tcPr>
-            <w:tcW w:type="dxa" w:w="2340"/>
+            <w:tcW w:type="dxa" w:w="2448"/>
           </w:tcPr>
           <w:p>
             <w:r>
@@ -1017,7 +1358,7 @@
         <w:pStyle w:val="Heading2"/>
       </w:pPr>
       <w:r>
-        <w:t>3.3 Confusion Matrix and ROC</w:t>
+        <w:t>3.4 Confusion Matrix and ROC</w:t>
       </w:r>
     </w:p>
     <w:p>
@@ -1027,7 +1368,7 @@
       <w:r>
         <w:drawing>
           <wp:inline xmlns:a="http://schemas.openxmlformats.org/drawingml/2006/main" xmlns:pic="http://schemas.openxmlformats.org/drawingml/2006/picture">
-            <wp:extent cx="4937760" cy="4039985"/>
+            <wp:extent cx="3931920" cy="3217025"/>
             <wp:docPr id="1" name="Picture 1"/>
             <wp:cNvGraphicFramePr>
               <a:graphicFrameLocks noChangeAspect="1"/>
@@ -1036,7 +1377,7 @@
               <a:graphicData uri="http://schemas.openxmlformats.org/drawingml/2006/picture">
                 <pic:pic>
                   <pic:nvPicPr>
-                    <pic:cNvPr id="0" name="confusion_matrix_test_lgb.png"/>
+                    <pic:cNvPr id="0" name="confusion_matrix_test_twostage.png"/>
                     <pic:cNvPicPr/>
                   </pic:nvPicPr>
                   <pic:blipFill>
@@ -1048,7 +1389,7 @@
                   <pic:spPr>
                     <a:xfrm>
                       <a:off x="0" y="0"/>
-                      <a:ext cx="4937760" cy="4039985"/>
+                      <a:ext cx="3931920" cy="3217025"/>
                     </a:xfrm>
                     <a:prstGeom prst="rect"/>
                   </pic:spPr>
@@ -1064,7 +1405,7 @@
         <w:jc w:val="center"/>
       </w:pPr>
       <w:r>
-        <w:t>Figure 1. LightGBM confusion matrix on the unseen test set.</w:t>
+        <w:t>Figure 1. Two-stage confusion matrix on the unseen test set.</w:t>
       </w:r>
     </w:p>
     <w:p>
@@ -1074,7 +1415,7 @@
       <w:r>
         <w:drawing>
           <wp:inline xmlns:a="http://schemas.openxmlformats.org/drawingml/2006/main" xmlns:pic="http://schemas.openxmlformats.org/drawingml/2006/picture">
-            <wp:extent cx="4389120" cy="3511296"/>
+            <wp:extent cx="3108960" cy="2630658"/>
             <wp:docPr id="2" name="Picture 2"/>
             <wp:cNvGraphicFramePr>
               <a:graphicFrameLocks noChangeAspect="1"/>
@@ -1083,7 +1424,7 @@
               <a:graphicData uri="http://schemas.openxmlformats.org/drawingml/2006/picture">
                 <pic:pic>
                   <pic:nvPicPr>
-                    <pic:cNvPr id="0" name="roc_auc_test_lgb.png"/>
+                    <pic:cNvPr id="0" name="roc_auc_test_twostage.png"/>
                     <pic:cNvPicPr/>
                   </pic:nvPicPr>
                   <pic:blipFill>
@@ -1095,7 +1436,7 @@
                   <pic:spPr>
                     <a:xfrm>
                       <a:off x="0" y="0"/>
-                      <a:ext cx="4389120" cy="3511296"/>
+                      <a:ext cx="3108960" cy="2630658"/>
                     </a:xfrm>
                     <a:prstGeom prst="rect"/>
                   </pic:spPr>
@@ -1111,7 +1452,7 @@
         <w:jc w:val="center"/>
       </w:pPr>
       <w:r>
-        <w:t>Figure 2. One-vs-rest ROC curves (LightGBM, test set).</w:t>
+        <w:t>Figure 2. ROC of the Normal-vs-attack detector (AUC 0.985) with the chosen operating point.</w:t>
       </w:r>
     </w:p>
     <w:p>
@@ -1119,7 +1460,7 @@
         <w:pStyle w:val="Heading2"/>
       </w:pPr>
       <w:r>
-        <w:t>3.4 Critical Analysis</w:t>
+        <w:t>3.5 Critical Analysis</w:t>
       </w:r>
     </w:p>
     <w:p>
@@ -1127,7 +1468,7 @@
         <w:pStyle w:val="ListBullet"/>
       </w:pPr>
       <w:r>
-        <w:t>Attack-vs-normal detection is strong. Only 496 of 45,332 malicious flows were predicted as Normal (about 98.9% recall when all attack classes are merged). Most errors are between attack families, which still raise an alert.</w:t>
+        <w:t>Attack detection is strong: the detector separates Normal from attack with ROC-AUC 0.985 and catches 96.5% of malicious flows. Only about 1,600 of 45,332 attacks passed as Normal.</w:t>
       </w:r>
     </w:p>
     <w:p>
@@ -1135,7 +1476,7 @@
         <w:pStyle w:val="ListBullet"/>
       </w:pPr>
       <w:r>
-        <w:t>False alarms are high. 12,146 of 37,000 normal flows (32.8%) were flagged, mostly as Fuzzers (9,184) and Analysis (2,003). Analysts would face alert fatigue; threshold tuning or a two-stage design is needed before production use.</w:t>
+        <w:t>False alarms (15.4%) are the main operational cost. They can be cut to 2.6% by raising the threshold to 0.9, at the price of missing about 11% of attacks. This trade-off, not a single accuracy number, is what management should decide on.</w:t>
       </w:r>
     </w:p>
     <w:p>
@@ -1143,7 +1484,7 @@
         <w:pStyle w:val="ListBullet"/>
       </w:pPr>
       <w:r>
-        <w:t>Low recall on Analysis (15%) and Backdoor (22%): these were mostly confused with DoS. Backdoors give persistent attacker access, so mislabelling them could send responders down the wrong playbook and leave the compromise in place, which is a critical flaw.</w:t>
+        <w:t>Analysis (recall 7%) and Backdoor (precision 7%) cannot be told apart from other traffic reliably. Backdoors give an attacker persistent access, so a low-precision Backdoor alert means either analyst time wasted on false alerts or real compromises hidden among them. This is a known weakness of UNSW-NB15 labels for these classes: every variant we tried scored about 4-5% precision on Analysis.</w:t>
       </w:r>
     </w:p>
     <w:p>
@@ -1151,7 +1492,7 @@
         <w:pStyle w:val="ListBullet"/>
       </w:pPr>
       <w:r>
-        <w:t>DoS (41% recall) and Exploits (61%) overlap in feature space: 1,713 exploit flows were labelled DoS and 1,140 DoS flows as Backdoor, so incidents may be mis-triaged.</w:t>
+        <w:t>DoS recall is only 19%: most DoS flows are labelled Exploits or Fuzzers, so availability incidents may be mis-triaged even though the flow is flagged as malicious.</w:t>
       </w:r>
     </w:p>
     <w:p>
@@ -1159,7 +1500,7 @@
         <w:pStyle w:val="ListBullet"/>
       </w:pPr>
       <w:r>
-        <w:t>Generic (recall 97%), Reconnaissance (82%), Shellcode (91%) and Worms (80%) are detected well, although Shellcode/Worms precision is low because so few real samples exist.</w:t>
+        <w:t>Generic (F1 0.98), Reconnaissance (0.85) and Exploits (0.69) are identified well. Shellcode and Worms have high recall (97% and 86%) but low precision because they have very few real samples.</w:t>
       </w:r>
     </w:p>
     <w:p>
@@ -1167,7 +1508,7 @@
         <w:pStyle w:val="ListBullet"/>
       </w:pPr>
       <w:r>
-        <w:t>The gap between validation accuracy (78%) and test accuracy (71%) shows distribution shift between the official partitions and the effect of synthetic oversampling; the validation score is optimistic.</w:t>
+        <w:t>Lessons from the first round: (1) oversampling before splitting leaked synthetic samples into validation and inflated it to 78% while test accuracy was 71%; (2) the serving code zeroed ten columns the first models were trained with, costing about 1.7 accuracy points in the dashboard until fixed; (3) a random split inside the training partition scores about 81%, so roughly ten points of the gap are due to the shift between the official partitions, not to the model.</w:t>
       </w:r>
     </w:p>
     <w:p>
@@ -1180,7 +1521,7 @@
     </w:p>
     <w:p>
       <w:r>
-        <w:t>The trained pipeline (preprocessing + LightGBM) is served by a FastAPI backend with API-key authentication and CORS restrictions, offering single-record and batch CSV endpoints. A dark-mode web dashboard lets a SOC analyst submit a flow or upload a CSV and see predicted classes and distribution charts, demonstrating real-time threat detection.</w:t>
+        <w:t>The trained two-stage pipeline is served by a FastAPI backend with API-key authentication and CORS restrictions, offering single-record and batch CSV endpoints. A dark-mode web dashboard lets a SOC analyst submit a flow or upload a CSV and see predicted classes and distribution charts, demonstrating real-time threat detection.</w:t>
       </w:r>
     </w:p>
     <w:p>
@@ -1193,7 +1534,7 @@
     </w:p>
     <w:p>
       <w:r>
-        <w:t>The proof of concept shows ML can augment the NIDS: it catches nearly all malicious flows and identifies common attack families accurately, answering the CISO's viability question. Its false-positive rate and weak rare-class recall prevent unsupervised deployment. Future work: cost-sensitive learning and threshold tuning to trade recall against false alarms; a two-stage model (binary detector followed by a family classifier); better feature engineering; cross-dataset validation (CIC-IDS2017); sequence/deep models; SHAP explainability; and continuous retraining on live traffic.</w:t>
+        <w:t>The proof of concept shows ML can augment the NIDS: the two-stage model catches about 96% of malicious flows with a tunable false-alarm rate and identifies common attack families accurately, answering the CISO's viability question. Its false-alarm rate at the default threshold and weak rare-class precision prevent unsupervised deployment; it is best used to prioritise alerts for analysts. Future work: retraining on traffic from the target network to remove the partition shift; probability calibration and per-class thresholds; better feature engineering for Analysis/Backdoor/DoS; cross-dataset validation (CIC-IDS2017); sequence/deep models; SHAP explainability; and continuous retraining on live traffic.</w:t>
       </w:r>
     </w:p>
     <w:p>
@@ -1251,7 +1592,7 @@
     </w:p>
     <w:sectPr>
       <w:pgSz w:w="12240" w:h="15840"/>
-      <w:pgMar w:top="1296" w:right="1440" w:bottom="1296" w:left="1440" w:header="720" w:footer="720" w:gutter="0"/>
+      <w:pgMar w:top="1008" w:right="1224" w:bottom="1008" w:left="1224" w:header="720" w:footer="720" w:gutter="0"/>
       <w:cols w:space="720"/>
       <w:docGrid w:linePitch="360"/>
     </w:sectPr>
@@ -1624,7 +1965,7 @@
     <w:rsid w:val="00FC693F"/>
     <w:rPr>
       <w:rFonts w:ascii="Calibri" w:hAnsi="Calibri"/>
-      <w:sz w:val="22"/>
+      <w:sz w:val="20"/>
     </w:rPr>
   </w:style>
   <w:style w:type="paragraph" w:styleId="Header">

</xml_diff>